<commit_message>
Resume: fit on one page; build fails if it ever runs to two
Co-Authored-By: Claude Opus 5.5 <noreply@anthropic.com>
</commit_message>
<xml_diff>
--- a/Resume/Siddhesh_Amrale_Resume.docx
+++ b/Resume/Siddhesh_Amrale_Resume.docx
@@ -10,28 +10,28 @@
         <w:rPr>
           <w:b/>
           <w:i w:val="0"/>
-          <w:sz w:val="40"/>
+          <w:sz w:val="38"/>
         </w:rPr>
         <w:t>Siddhesh Amrale</w:t>
       </w:r>
     </w:p>
     <w:p>
       <w:pPr>
-        <w:spacing w:after="40" w:before="0"/>
+        <w:spacing w:after="0" w:before="0"/>
       </w:pPr>
       <w:r>
         <w:rPr>
           <w:b w:val="0"/>
           <w:i w:val="0"/>
           <w:color w:val="444444"/>
-          <w:sz w:val="23"/>
+          <w:sz w:val="22"/>
         </w:rPr>
-        <w:t>Data &amp; AI Platform Engineer</w:t>
+        <w:t>Data &amp; AI Platform Engineer | Pittsburgh, PA, open to relocation</w:t>
       </w:r>
     </w:p>
     <w:p>
       <w:pPr>
-        <w:spacing w:after="40" w:before="0"/>
+        <w:spacing w:after="0" w:before="0"/>
       </w:pPr>
       <w:r>
         <w:rPr>
@@ -40,12 +40,26 @@
           <w:color w:val="444444"/>
           <w:sz w:val="18"/>
         </w:rPr>
-        <w:t>Pittsburgh, PA (open to relocation) | siddhesh.amrale@gmail.com | +1 (973) 438-8729 | linkedin.com/in/siddheshnitinamrale | github.com/SiddheshAmrale | gentle-river-08010bc0f.1.azurestaticapps.net</w:t>
+        <w:t>siddhesh.amrale@gmail.com | +1 (973) 438-8729 | linkedin.com/in/siddheshnitinamrale</w:t>
       </w:r>
     </w:p>
     <w:p>
       <w:pPr>
-        <w:spacing w:after="60" w:before="140"/>
+        <w:spacing w:after="0" w:before="0"/>
+      </w:pPr>
+      <w:r>
+        <w:rPr>
+          <w:b w:val="0"/>
+          <w:i w:val="0"/>
+          <w:color w:val="444444"/>
+          <w:sz w:val="18"/>
+        </w:rPr>
+        <w:t>github.com/SiddheshAmrale | Portfolio: gentle-river-08010bc0f.1.azurestaticapps.net</w:t>
+      </w:r>
+    </w:p>
+    <w:p>
+      <w:pPr>
+        <w:spacing w:after="40" w:before="100"/>
         <w:pBdr>
           <w:bottom w:val="single" w:sz="6" w:space="1" w:color="999999"/>
         </w:pBdr>
@@ -54,7 +68,7 @@
         <w:rPr>
           <w:b/>
           <w:i w:val="0"/>
-          <w:sz w:val="21"/>
+          <w:sz w:val="20"/>
         </w:rPr>
         <w:t>SUMMARY</w:t>
       </w:r>
@@ -68,12 +82,12 @@
           <w:b w:val="0"/>
           <w:i w:val="0"/>
         </w:rPr>
-        <w:t>Data and AI platform engineer with 6+ years of experience, building alongside the people who use the work. Started in full-stack product work in Pune, moved to mortgage data pipelines and APIs at Freddie Mac while earning an MS in Computer Science at NJIT, and now own Pittsburgh International Airport's data and AI platform end to end: ~50 source connectors, 60 Databricks pipelines, real-time IoT streams, LLM enrichment and RAG agents, all deployed as code. The loop: sit with the operations team, map the real workflow, ship a working version fast, measure it, then harden it into a platform.</w:t>
+        <w:t>Data and AI platform engineer, 6+ years. Started in full-stack product work in Pune, moved to mortgage data pipelines at Freddie Mac while earning an MS at NJIT, and now own Pittsburgh International Airport's data and AI platform. The loop: sit with the people who use the data, ship a working version fast, measure it, then harden it into a platform.</w:t>
       </w:r>
     </w:p>
     <w:p>
       <w:pPr>
-        <w:spacing w:after="60" w:before="140"/>
+        <w:spacing w:after="40" w:before="100"/>
         <w:pBdr>
           <w:bottom w:val="single" w:sz="6" w:space="1" w:color="999999"/>
         </w:pBdr>
@@ -82,28 +96,28 @@
         <w:rPr>
           <w:b/>
           <w:i w:val="0"/>
-          <w:sz w:val="21"/>
+          <w:sz w:val="20"/>
         </w:rPr>
         <w:t>SKILLS</w:t>
       </w:r>
     </w:p>
     <w:p>
       <w:pPr>
-        <w:spacing w:after="20" w:before="0"/>
+        <w:spacing w:after="10" w:before="0"/>
       </w:pPr>
       <w:r>
         <w:rPr>
           <w:b/>
         </w:rPr>
-        <w:t xml:space="preserve">Data engineering: </w:t>
+        <w:t xml:space="preserve">Data: </w:t>
       </w:r>
       <w:r>
-        <w:t>SQL, Python, PySpark, Apache Spark, Databricks (Lakeflow/DLT, Unity Catalog, Auto Loader, Asset Bundles), Delta Lake, Parquet, DuckDB, dbt, Airflow, Snowflake, ETL/ELT, CDC, SCD Type 2, dimensional modeling, data warehousing, data quality, data governance, Power BI</w:t>
+        <w:t>SQL, Python, PySpark, Apache Spark, Databricks (Lakeflow/DLT, Unity Catalog), Delta Lake, dbt, Airflow, Snowflake, DuckDB, Parquet, ETL/ELT, CDC, SCD Type 2, data modeling, data warehousing, data quality, governance</w:t>
       </w:r>
     </w:p>
     <w:p>
       <w:pPr>
-        <w:spacing w:after="20" w:before="0"/>
+        <w:spacing w:after="10" w:before="0"/>
       </w:pPr>
       <w:r>
         <w:rPr>
@@ -112,12 +126,12 @@
         <w:t xml:space="preserve">Streaming: </w:t>
       </w:r>
       <w:r>
-        <w:t>Azure Event Hubs, IoT Hub, Azure Data Explorer (Kusto/KQL), Kafka, event-driven architecture, watermarking, late and out-of-order data</w:t>
+        <w:t>Kafka, Azure Event Hubs, IoT Hub, Azure Data Explorer (KQL), event-driven architecture, late and out-of-order data</w:t>
       </w:r>
     </w:p>
     <w:p>
       <w:pPr>
-        <w:spacing w:after="20" w:before="0"/>
+        <w:spacing w:after="10" w:before="0"/>
       </w:pPr>
       <w:r>
         <w:rPr>
@@ -126,26 +140,26 @@
         <w:t xml:space="preserve">AI: </w:t>
       </w:r>
       <w:r>
-        <w:t>LLM apps and pipelines, RAG, AI agents, MCP, LLM evaluation, Azure OpenAI, Semantic Kernel, Databricks ai_query, prompt versioning, MLflow</w:t>
+        <w:t>LLM apps and pipelines, RAG, AI agents, MCP, LLM evaluation, Azure OpenAI, Semantic Kernel, prompt versioning, MLflow</w:t>
       </w:r>
     </w:p>
     <w:p>
       <w:pPr>
-        <w:spacing w:after="20" w:before="0"/>
+        <w:spacing w:after="10" w:before="0"/>
       </w:pPr>
       <w:r>
         <w:rPr>
           <w:b/>
         </w:rPr>
-        <w:t xml:space="preserve">Platform &amp; cloud: </w:t>
+        <w:t xml:space="preserve">Cloud &amp; platform: </w:t>
       </w:r>
       <w:r>
-        <w:t>Azure (Functions, Data Lake Storage, Key Vault, API Management, DevOps), AWS (S3, Lambda, EKS), Terraform, Bicep, Docker, Kubernetes (AKS, EKS), GitHub Actions, ArgoCD, CI/CD, OIDC, Prometheus, Grafana, SLIs/SLOs</w:t>
+        <w:t>Azure, AWS (S3, Lambda, EKS), Terraform, Bicep, Docker, Kubernetes, GitHub Actions, Azure DevOps, ArgoCD, Prometheus, Grafana</w:t>
       </w:r>
     </w:p>
     <w:p>
       <w:pPr>
-        <w:spacing w:after="20" w:before="0"/>
+        <w:spacing w:after="10" w:before="0"/>
       </w:pPr>
       <w:r>
         <w:rPr>
@@ -154,26 +168,12 @@
         <w:t xml:space="preserve">Languages &amp; apps: </w:t>
       </w:r>
       <w:r>
-        <w:t>Python, SQL/KQL, C#/.NET 8, TypeScript, JavaScript/Node.js, Java, Rust, React, Angular, REST, GraphQL, Cypress</w:t>
+        <w:t>Python, SQL/KQL, C#/.NET, TypeScript, JavaScript/Node.js, Java, Rust, React, Angular, REST, GraphQL</w:t>
       </w:r>
     </w:p>
     <w:p>
       <w:pPr>
-        <w:spacing w:after="20" w:before="0"/>
-      </w:pPr>
-      <w:r>
-        <w:rPr>
-          <w:b/>
-        </w:rPr>
-        <w:t xml:space="preserve">Working with users: </w:t>
-      </w:r>
-      <w:r>
-        <w:t>Workflow discovery with operations teams, rapid prototyping, production rollout, stakeholder management</w:t>
-      </w:r>
-    </w:p>
-    <w:p>
-      <w:pPr>
-        <w:spacing w:after="60" w:before="140"/>
+        <w:spacing w:after="40" w:before="100"/>
         <w:pBdr>
           <w:bottom w:val="single" w:sz="6" w:space="1" w:color="999999"/>
         </w:pBdr>
@@ -182,7 +182,7 @@
         <w:rPr>
           <w:b/>
           <w:i w:val="0"/>
-          <w:sz w:val="21"/>
+          <w:sz w:val="20"/>
         </w:rPr>
         <w:t>EXPERIENCE</w:t>
       </w:r>
@@ -190,9 +190,9 @@
     <w:p>
       <w:pPr>
         <w:tabs>
-          <w:tab w:pos="10512" w:val="right"/>
+          <w:tab w:pos="10656" w:val="right"/>
         </w:tabs>
-        <w:spacing w:after="0" w:before="100"/>
+        <w:spacing w:after="0" w:before="80"/>
       </w:pPr>
       <w:r>
         <w:rPr>
@@ -223,92 +223,70 @@
     </w:p>
     <w:p>
       <w:pPr>
-        <w:spacing w:after="20" w:before="0"/>
+        <w:pStyle w:val="ListBullet"/>
+        <w:spacing w:after="20"/>
+        <w:ind w:left="288" w:hanging="202"/>
       </w:pPr>
       <w:r>
-        <w:rPr>
-          <w:b w:val="0"/>
-          <w:i w:val="0"/>
-        </w:rPr>
-        <w:t>Own the airport's data and AI platform end to end, from device and vendor feeds to the data products and apps operations staff use every day.</w:t>
+        <w:t>Designed and built the One Data Platform on Databricks: 60 Lakeflow (DLT) pipelines and 58 jobs on Unity Catalog across flights, baggage, parking, finance, workforce and customer experience; SCD2 silver and gold data products in Power BI for 5 business units.</w:t>
       </w:r>
     </w:p>
     <w:p>
       <w:pPr>
         <w:pStyle w:val="ListBullet"/>
-        <w:spacing w:after="30"/>
+        <w:spacing w:after="20"/>
         <w:ind w:left="288" w:hanging="202"/>
       </w:pPr>
       <w:r>
-        <w:t>Designed and built the One Data Platform on Databricks: 60 Lakeflow (DLT) pipelines and 58 jobs on Unity Catalog across flights, baggage, parking, ground transport, finance, workforce and customer experience. Auto Loader bronze, SCD2 silver and gold data products feed Power BI for 5 business units.</w:t>
+        <w:t>Built a reusable ingestion platform on .NET 8 Azure Functions (~50 connectors, 1,300+ unit tests) with watermark/CDC loads, gap detection and replay. New sources take 2 days instead of weeks; leaving Azure Data Factory identified $400K+ a year in savings.</w:t>
       </w:r>
     </w:p>
     <w:p>
       <w:pPr>
         <w:pStyle w:val="ListBullet"/>
-        <w:spacing w:after="30"/>
+        <w:spacing w:after="20"/>
         <w:ind w:left="288" w:hanging="202"/>
       </w:pPr>
       <w:r>
-        <w:t>Built a reusable ingestion platform on .NET 8 Azure Functions (16 function apps, ~50 connectors including Amadeus, SITA, Daifuku, Workday, TSA and FAA) with watermark/CDC loads, gap detection and time-range reprocessing. New sources now take 2 days instead of weeks, moving off Azure Data Factory identified $400K+ a year in savings, and 1,300+ unit tests keep it safe to change.</w:t>
+        <w:t>Work directly with operations teams to map how they really work, then ship React + MSAL apps and Kusto-backed APIs they use daily (parking kiosks, live gate map, concessions); incident response time down 40%.</w:t>
       </w:r>
     </w:p>
     <w:p>
       <w:pPr>
         <w:pStyle w:val="ListBullet"/>
-        <w:spacing w:after="30"/>
+        <w:spacing w:after="20"/>
         <w:ind w:left="288" w:hanging="202"/>
       </w:pPr>
       <w:r>
-        <w:t>Work directly with operations teams to map how they really work, then ship React + MSAL apps and Kusto-backed data APIs they use daily (parking kiosks, live gate status map, concessions, staff directory), covered by Cypress E2E tests. Incident response time down 40%.</w:t>
+        <w:t>Put LLMs inside the pipeline: Databricks ai_query (Llama 3.3 70B) turns FAA NOTAMs and passenger feedback into summaries and sentiment, with strict JSON output, versioned prompts, a kill switch and a content-hashed cache for deterministic reruns.</w:t>
       </w:r>
     </w:p>
     <w:p>
       <w:pPr>
         <w:pStyle w:val="ListBullet"/>
-        <w:spacing w:after="30"/>
+        <w:spacing w:after="20"/>
         <w:ind w:left="288" w:hanging="202"/>
       </w:pPr>
       <w:r>
-        <w:t>Put LLMs inside the pipeline: Databricks ai_query (Llama 3.3 70B) turns FAA NOTAMs and customer feedback into plain-English summaries and sentiment, with strict JSON output, versioned prompts, a kill switch and a content-hashed Delta cache that keeps reruns deterministic and cheap.</w:t>
+        <w:t>Built RAG agents on Azure OpenAI and Semantic Kernel over governed data, gated by evaluation sets; five teams now self-serve answers and ad-hoc report requests fell ~60%.</w:t>
       </w:r>
     </w:p>
     <w:p>
       <w:pPr>
         <w:pStyle w:val="ListBullet"/>
-        <w:spacing w:after="30"/>
+        <w:spacing w:after="20"/>
         <w:ind w:left="288" w:hanging="202"/>
       </w:pPr>
       <w:r>
-        <w:t>Built RAG agents on Azure OpenAI and Semantic Kernel over governed data, orchestrated with Airflow and checked against evaluation sets before changes ship. Five business teams now self-serve answers; ad-hoc report requests fell by about 60%.</w:t>
-      </w:r>
-    </w:p>
-    <w:p>
-      <w:pPr>
-        <w:pStyle w:val="ListBullet"/>
-        <w:spacing w:after="30"/>
-        <w:ind w:left="288" w:hanging="202"/>
-      </w:pPr>
-      <w:r>
-        <w:t>Built the real-time path: ~70 Azure Functions and a Node.js decoder for LoRaWAN sensors, people counters and camera analytics, streaming through IoT Hub and Event Hubs into Azure Data Explorer (KQL) for occupancy, gate and parking data at about 5-minute freshness.</w:t>
-      </w:r>
-    </w:p>
-    <w:p>
-      <w:pPr>
-        <w:pStyle w:val="ListBullet"/>
-        <w:spacing w:after="30"/>
-        <w:ind w:left="288" w:hanging="202"/>
-      </w:pPr>
-      <w:r>
-        <w:t>Run the platform as code: Terraform, Databricks Asset Bundles, Bicep and Azure DevOps with OIDC and approval-gated production; Unity Catalog grants reconciled from code; alerts on pipeline failures, freshness and latency.</w:t>
+        <w:t>Built the real-time path: ~70 Azure Functions over IoT Hub and Event Hubs into Azure Data Explorer at ~5-minute freshness, all deployed with Terraform, Asset Bundles and Azure DevOps.</w:t>
       </w:r>
     </w:p>
     <w:p>
       <w:pPr>
         <w:tabs>
-          <w:tab w:pos="10512" w:val="right"/>
+          <w:tab w:pos="10656" w:val="right"/>
         </w:tabs>
-        <w:spacing w:after="0" w:before="100"/>
+        <w:spacing w:after="0" w:before="80"/>
       </w:pPr>
       <w:r>
         <w:rPr>
@@ -339,62 +317,40 @@
     </w:p>
     <w:p>
       <w:pPr>
-        <w:spacing w:after="20" w:before="0"/>
+        <w:pStyle w:val="ListBullet"/>
+        <w:spacing w:after="20"/>
+        <w:ind w:left="288" w:hanging="202"/>
       </w:pPr>
       <w:r>
-        <w:rPr>
-          <w:b w:val="0"/>
-          <w:i w:val="0"/>
-        </w:rPr>
-        <w:t>Mortgage data pipelines and APIs for risk and compliance analytics, while completing an MS in Computer Science at NJIT.</w:t>
+        <w:t>Built Python/SQL pipelines for loan-level mortgage data with automated validation and reconciliation; manual review down 40%.</w:t>
       </w:r>
     </w:p>
     <w:p>
       <w:pPr>
         <w:pStyle w:val="ListBullet"/>
-        <w:spacing w:after="30"/>
+        <w:spacing w:after="20"/>
         <w:ind w:left="288" w:hanging="202"/>
       </w:pPr>
       <w:r>
-        <w:t>Built Python and SQL ingestion pipelines for loan-level mortgage data, with automated validation, reconciliation and quality checks that cut manual data review by 40%.</w:t>
+        <w:t>Designed a GraphQL + REST data gateway (Node.js, Java, Azure API Management, Entra ID) serving decisioning data at 1K+ requests/s, P95 under 10 ms; SLOs, circuit breakers and idempotent retries held 99.95% uptime.</w:t>
       </w:r>
     </w:p>
     <w:p>
       <w:pPr>
         <w:pStyle w:val="ListBullet"/>
-        <w:spacing w:after="30"/>
+        <w:spacing w:after="20"/>
         <w:ind w:left="288" w:hanging="202"/>
       </w:pPr>
       <w:r>
-        <w:t>Designed a GraphQL and REST data gateway (Node.js, Java) behind Azure API Management with Entra ID auth, caching and rate limiting, serving mortgage decisioning data at 1K+ requests/s with P95 latency under 10 ms.</w:t>
-      </w:r>
-    </w:p>
-    <w:p>
-      <w:pPr>
-        <w:pStyle w:val="ListBullet"/>
-        <w:spacing w:after="30"/>
-        <w:ind w:left="288" w:hanging="202"/>
-      </w:pPr>
-      <w:r>
-        <w:t>Defined SLIs, SLOs and error budgets, and added circuit breakers, idempotency and retries with backoff across data services, holding 99.95% uptime.</w:t>
-      </w:r>
-    </w:p>
-    <w:p>
-      <w:pPr>
-        <w:pStyle w:val="ListBullet"/>
-        <w:spacing w:after="30"/>
-        <w:ind w:left="288" w:hanging="202"/>
-      </w:pPr>
-      <w:r>
-        <w:t>Moved on-prem workflows and 12+ services onto Kubernetes (AKS, EKS) with GitHub Actions CI/CD and ArgoCD canary and blue-green releases: release cycles 50% shorter, deployment incidents down 30%.</w:t>
+        <w:t>Moved 12+ services onto Kubernetes (AKS, EKS) with GitHub Actions and ArgoCD canary releases: release cycles 50% shorter, deployment incidents down 30%.</w:t>
       </w:r>
     </w:p>
     <w:p>
       <w:pPr>
         <w:tabs>
-          <w:tab w:pos="10512" w:val="right"/>
+          <w:tab w:pos="10656" w:val="right"/>
         </w:tabs>
-        <w:spacing w:after="0" w:before="100"/>
+        <w:spacing w:after="0" w:before="80"/>
       </w:pPr>
       <w:r>
         <w:rPr>
@@ -425,49 +381,27 @@
     </w:p>
     <w:p>
       <w:pPr>
-        <w:spacing w:after="20" w:before="0"/>
+        <w:pStyle w:val="ListBullet"/>
+        <w:spacing w:after="20"/>
+        <w:ind w:left="288" w:hanging="202"/>
       </w:pPr>
       <w:r>
-        <w:rPr>
-          <w:b w:val="0"/>
-          <w:i w:val="0"/>
-        </w:rPr>
-        <w:t>Where I started: full-stack products and the data services behind them for enterprise clients.</w:t>
+        <w:t>Built full-stack apps (Angular, Java, MongoDB) for media delivery over Azure Blob Storage and CDN: 10M+ requests a day under 90 ms p99. Batch ETL cut metadata refresh from 4 hours to under 20 minutes.</w:t>
       </w:r>
     </w:p>
     <w:p>
       <w:pPr>
         <w:pStyle w:val="ListBullet"/>
-        <w:spacing w:after="30"/>
+        <w:spacing w:after="20"/>
         <w:ind w:left="288" w:hanging="202"/>
       </w:pPr>
       <w:r>
-        <w:t>Built full-stack web applications (Angular, Java, MongoDB) for media content delivery over Azure Blob Storage and CDN, serving 10M+ requests a day at under 90 ms p99.</w:t>
+        <w:t>Added Prometheus and Grafana SLI dashboards and alerts, then fixed the worst bottlenecks: availability rose from 99.5% to 99.9%.</w:t>
       </w:r>
     </w:p>
     <w:p>
       <w:pPr>
-        <w:pStyle w:val="ListBullet"/>
-        <w:spacing w:after="30"/>
-        <w:ind w:left="288" w:hanging="202"/>
-      </w:pPr>
-      <w:r>
-        <w:t>Built batch ETL for content metadata, cutting refresh lag from 4 hours to under 20 minutes.</w:t>
-      </w:r>
-    </w:p>
-    <w:p>
-      <w:pPr>
-        <w:pStyle w:val="ListBullet"/>
-        <w:spacing w:after="30"/>
-        <w:ind w:left="288" w:hanging="202"/>
-      </w:pPr>
-      <w:r>
-        <w:t>Added Prometheus and Grafana dashboards and alerts on latency, throughput and error-rate SLIs, then fixed the worst bottlenecks: availability rose from 99.5% to 99.9%.</w:t>
-      </w:r>
-    </w:p>
-    <w:p>
-      <w:pPr>
-        <w:spacing w:after="60" w:before="140"/>
+        <w:spacing w:after="40" w:before="100"/>
         <w:pBdr>
           <w:bottom w:val="single" w:sz="6" w:space="1" w:color="999999"/>
         </w:pBdr>
@@ -476,130 +410,74 @@
         <w:rPr>
           <w:b/>
           <w:i w:val="0"/>
-          <w:sz w:val="21"/>
+          <w:sz w:val="20"/>
         </w:rPr>
         <w:t>PROJECTS</w:t>
       </w:r>
     </w:p>
     <w:p>
       <w:pPr>
-        <w:spacing w:after="0" w:before="60"/>
+        <w:spacing w:after="20" w:before="0"/>
       </w:pPr>
       <w:r>
         <w:rPr>
           <w:b/>
         </w:rPr>
-        <w:t>Agent-Ready Lakehouse</w:t>
+        <w:t xml:space="preserve">Agent-Ready Lakehouse: </w:t>
+      </w:r>
+      <w:r>
+        <w:t xml:space="preserve">MCP server giving AI agents governed, audited, read-only access to lakehouse data; dbt layer with 16 data tests; CI eval gate on accuracy and 23 attack cases. </w:t>
       </w:r>
       <w:r>
         <w:rPr>
           <w:color w:val="444444"/>
         </w:rPr>
-        <w:t xml:space="preserve"> | Python, MCP, DuckDB, dbt, sqlglot, GitHub Actions | github.com/SiddheshAmrale/agent-ready-lakehouse</w:t>
+        <w:t>github.com/SiddheshAmrale/agent-ready-lakehouse</w:t>
       </w:r>
     </w:p>
     <w:p>
       <w:pPr>
-        <w:spacing w:after="0" w:before="0"/>
-      </w:pPr>
-      <w:r>
-        <w:rPr>
-          <w:b w:val="0"/>
-          <w:i w:val="0"/>
-        </w:rPr>
-        <w:t>MCP server that gives AI agents governed, read-only access to lakehouse data: SQL allow-list, per-role sandboxes with masking and row filters, a locked engine and an audit log; gold layer also built in dbt with 16 data tests. A CI eval gate checks metric accuracy against an independent oracle, 23 attack and out-of-scope requests, and latency.</w:t>
-      </w:r>
-    </w:p>
-    <w:p>
-      <w:pPr>
-        <w:spacing w:after="0" w:before="60"/>
+        <w:spacing w:after="20" w:before="0"/>
       </w:pPr>
       <w:r>
         <w:rPr>
           <w:b/>
         </w:rPr>
-        <w:t>Lakehouse Forge</w:t>
+        <w:t xml:space="preserve">VELA: </w:t>
+      </w:r>
+      <w:r>
+        <w:t xml:space="preserve">Rust + libmpv media player: 5.6% CPU on HEVC vs 9.8% for stock mpv, 2.2 MB binary. </w:t>
       </w:r>
       <w:r>
         <w:rPr>
           <w:color w:val="444444"/>
         </w:rPr>
-        <w:t xml:space="preserve"> | Python, DuckDB, Parquet, pytest | portfolio: /labs/forge</w:t>
+        <w:t>github.com/SiddheshAmrale/vela</w:t>
       </w:r>
     </w:p>
     <w:p>
       <w:pPr>
-        <w:spacing w:after="0" w:before="0"/>
-      </w:pPr>
-      <w:r>
-        <w:rPr>
-          <w:b w:val="0"/>
-          <w:i w:val="0"/>
-        </w:rPr>
-        <w:t>Runnable medallion lakehouse with CDC/SCD2, data-contract quarantine, late-arriving facts, freshness SLAs and experiment health checks.</w:t>
-      </w:r>
-    </w:p>
-    <w:p>
-      <w:pPr>
-        <w:spacing w:after="0" w:before="60"/>
+        <w:spacing w:after="20" w:before="0"/>
       </w:pPr>
       <w:r>
         <w:rPr>
           <w:b/>
         </w:rPr>
-        <w:t>VELA, native media player</w:t>
+        <w:t xml:space="preserve">Lakehouse Forge: </w:t>
+      </w:r>
+      <w:r>
+        <w:t xml:space="preserve">Medallion lakehouse with CDC/SCD2, data contracts and freshness SLAs (Python, DuckDB). </w:t>
       </w:r>
       <w:r>
         <w:rPr>
           <w:color w:val="444444"/>
         </w:rPr>
-        <w:t xml:space="preserve"> | Rust, libmpv, OpenGL | github.com/SiddheshAmrale/vela</w:t>
+        <w:t>portfolio /labs/forge</w:t>
       </w:r>
     </w:p>
     <w:p>
       <w:pPr>
-        <w:spacing w:after="0" w:before="0"/>
-      </w:pPr>
-      <w:r>
-        <w:rPr>
-          <w:b w:val="0"/>
-          <w:i w:val="0"/>
-        </w:rPr>
-        <w:t>Cross-platform (Windows, macOS, Linux) player that renders only when a frame or the UI changes: 5.6% CPU on HEVC playback vs 9.8% for stock mpv, 2.2 MB binary, 85 end-to-end checks.</w:t>
-      </w:r>
-    </w:p>
-    <w:p>
-      <w:pPr>
-        <w:spacing w:after="0" w:before="60"/>
-      </w:pPr>
-      <w:r>
-        <w:rPr>
-          <w:b/>
-        </w:rPr>
-        <w:t>Telemetry and incident diagnosis labs</w:t>
-      </w:r>
-      <w:r>
-        <w:rPr>
-          <w:color w:val="444444"/>
-        </w:rPr>
-        <w:t xml:space="preserve"> | Python, Linux, GitHub Actions | portfolio: /labs/telemetry, /labs/incident</w:t>
-      </w:r>
-    </w:p>
-    <w:p>
-      <w:pPr>
-        <w:spacing w:after="0" w:before="0"/>
-      </w:pPr>
-      <w:r>
-        <w:rPr>
-          <w:b w:val="0"/>
-          <w:i w:val="0"/>
-        </w:rPr>
-        <w:t>Counter pipelines that hold up under duplicates, reordering, gaps and restarts; incident diagnosis scored on held-out cases, with live Linux network-namespace faults running in CI.</w:t>
-      </w:r>
-    </w:p>
-    <w:p>
-      <w:pPr>
-        <w:spacing w:after="60" w:before="140"/>
+        <w:spacing w:after="40" w:before="100"/>
         <w:pBdr>
           <w:bottom w:val="single" w:sz="6" w:space="1" w:color="999999"/>
         </w:pBdr>
@@ -608,67 +486,15 @@
         <w:rPr>
           <w:b/>
           <w:i w:val="0"/>
-          <w:sz w:val="21"/>
+          <w:sz w:val="20"/>
         </w:rPr>
-        <w:t>CERTIFICATIONS</w:t>
-      </w:r>
-    </w:p>
-    <w:p>
-      <w:pPr>
-        <w:spacing w:after="0" w:before="0"/>
-      </w:pPr>
-      <w:r>
-        <w:rPr>
-          <w:b w:val="0"/>
-          <w:i w:val="0"/>
-        </w:rPr>
-        <w:t>Microsoft Certified: Azure AI Engineer Associate (2025)</w:t>
-      </w:r>
-    </w:p>
-    <w:p>
-      <w:pPr>
-        <w:spacing w:after="0" w:before="0"/>
-      </w:pPr>
-      <w:r>
-        <w:rPr>
-          <w:b w:val="0"/>
-          <w:i w:val="0"/>
-        </w:rPr>
-        <w:t>Microsoft Certified: Azure Developer Associate (AZ-204, 2024)</w:t>
-      </w:r>
-    </w:p>
-    <w:p>
-      <w:pPr>
-        <w:spacing w:after="0" w:before="0"/>
-      </w:pPr>
-      <w:r>
-        <w:rPr>
-          <w:b w:val="0"/>
-          <w:i w:val="0"/>
-        </w:rPr>
-        <w:t>Microsoft Certified: Azure Administrator Associate (AZ-104, 2022)</w:t>
-      </w:r>
-    </w:p>
-    <w:p>
-      <w:pPr>
-        <w:spacing w:after="60" w:before="140"/>
-        <w:pBdr>
-          <w:bottom w:val="single" w:sz="6" w:space="1" w:color="999999"/>
-        </w:pBdr>
-      </w:pPr>
-      <w:r>
-        <w:rPr>
-          <w:b/>
-          <w:i w:val="0"/>
-          <w:sz w:val="21"/>
-        </w:rPr>
-        <w:t>EDUCATION</w:t>
+        <w:t>EDUCATION &amp; CERTIFICATIONS</w:t>
       </w:r>
     </w:p>
     <w:p>
       <w:pPr>
         <w:tabs>
-          <w:tab w:pos="10512" w:val="right"/>
+          <w:tab w:pos="10656" w:val="right"/>
         </w:tabs>
         <w:spacing w:after="0" w:before="0"/>
       </w:pPr>
@@ -683,7 +509,7 @@
     <w:p>
       <w:pPr>
         <w:tabs>
-          <w:tab w:pos="10512" w:val="right"/>
+          <w:tab w:pos="10656" w:val="right"/>
         </w:tabs>
         <w:spacing w:after="0" w:before="0"/>
       </w:pPr>
@@ -695,9 +521,21 @@
         <w:t>2019</w:t>
       </w:r>
     </w:p>
+    <w:p>
+      <w:pPr>
+        <w:spacing w:after="0" w:before="20"/>
+      </w:pPr>
+      <w:r>
+        <w:rPr>
+          <w:b w:val="0"/>
+          <w:i w:val="0"/>
+        </w:rPr>
+        <w:t>Microsoft Certified: Azure AI Engineer Associate (2025) · Azure Developer Associate (2024) · Azure Administrator Associate (2022)</w:t>
+      </w:r>
+    </w:p>
     <w:sectPr>
       <w:pgSz w:w="12240" w:h="15840"/>
-      <w:pgMar w:top="720" w:right="864" w:bottom="720" w:left="864" w:header="720" w:footer="720" w:gutter="0"/>
+      <w:pgMar w:top="648" w:right="792" w:bottom="648" w:left="792" w:header="720" w:footer="720" w:gutter="0"/>
       <w:cols w:space="720"/>
       <w:docGrid w:linePitch="360"/>
     </w:sectPr>
@@ -1074,7 +912,7 @@
     <w:rPr>
       <w:rFonts w:ascii="Calibri" w:hAnsi="Calibri" w:eastAsia="Calibri"/>
       <w:color w:val="111111"/>
-      <w:sz w:val="20"/>
+      <w:sz w:val="19"/>
     </w:rPr>
   </w:style>
   <w:style w:type="paragraph" w:styleId="Header">

</xml_diff>

<commit_message>
Resume: clickable links in PDF and DOCX, consistent tense, per-role JD match
Co-Authored-By: Claude Opus 5.5 <noreply@anthropic.com>
</commit_message>
<xml_diff>
--- a/Resume/Siddhesh_Amrale_Resume.docx
+++ b/Resume/Siddhesh_Amrale_Resume.docx
@@ -33,29 +33,77 @@
       <w:pPr>
         <w:spacing w:after="0" w:before="0"/>
       </w:pPr>
+      <w:hyperlink r:id="rId9">
+        <w:r>
+          <w:rPr>
+            <w:color w:val="1F4E8C"/>
+            <w:sz w:val="18"/>
+          </w:rPr>
+          <w:t xml:space="preserve">siddhesh.amrale@gmail.com</w:t>
+        </w:r>
+      </w:hyperlink>
       <w:r>
         <w:rPr>
-          <w:b w:val="0"/>
-          <w:i w:val="0"/>
           <w:color w:val="444444"/>
           <w:sz w:val="18"/>
         </w:rPr>
-        <w:t>siddhesh.amrale@gmail.com | +1 (973) 438-8729 | linkedin.com/in/siddheshnitinamrale</w:t>
+        <w:t xml:space="preserve"> | </w:t>
       </w:r>
+      <w:hyperlink r:id="rId10">
+        <w:r>
+          <w:rPr>
+            <w:color w:val="1F4E8C"/>
+            <w:sz w:val="18"/>
+          </w:rPr>
+          <w:t xml:space="preserve">+1 (973) 438-8729</w:t>
+        </w:r>
+      </w:hyperlink>
+      <w:r>
+        <w:rPr>
+          <w:color w:val="444444"/>
+          <w:sz w:val="18"/>
+        </w:rPr>
+        <w:t xml:space="preserve"> | </w:t>
+      </w:r>
+      <w:hyperlink r:id="rId11">
+        <w:r>
+          <w:rPr>
+            <w:color w:val="1F4E8C"/>
+            <w:sz w:val="18"/>
+          </w:rPr>
+          <w:t xml:space="preserve">linkedin.com/in/siddheshnitinamrale</w:t>
+        </w:r>
+      </w:hyperlink>
     </w:p>
     <w:p>
       <w:pPr>
         <w:spacing w:after="0" w:before="0"/>
       </w:pPr>
+      <w:hyperlink r:id="rId12">
+        <w:r>
+          <w:rPr>
+            <w:color w:val="1F4E8C"/>
+            <w:sz w:val="18"/>
+          </w:rPr>
+          <w:t xml:space="preserve">github.com/SiddheshAmrale</w:t>
+        </w:r>
+      </w:hyperlink>
       <w:r>
         <w:rPr>
-          <w:b w:val="0"/>
-          <w:i w:val="0"/>
           <w:color w:val="444444"/>
           <w:sz w:val="18"/>
         </w:rPr>
-        <w:t>github.com/SiddheshAmrale | Portfolio: gentle-river-08010bc0f.1.azurestaticapps.net</w:t>
+        <w:t xml:space="preserve"> | </w:t>
       </w:r>
+      <w:hyperlink r:id="rId13">
+        <w:r>
+          <w:rPr>
+            <w:color w:val="1F4E8C"/>
+            <w:sz w:val="18"/>
+          </w:rPr>
+          <w:t xml:space="preserve">Portfolio: gentle-river-08010bc0f.1.azurestaticapps.net</w:t>
+        </w:r>
+      </w:hyperlink>
     </w:p>
     <w:p>
       <w:pPr>
@@ -248,7 +296,7 @@
         <w:ind w:left="288" w:hanging="202"/>
       </w:pPr>
       <w:r>
-        <w:t>Work directly with operations teams to map how they really work, then ship React + MSAL apps and Kusto-backed APIs they use daily (parking kiosks, live gate map, concessions); incident response time down 40%.</w:t>
+        <w:t>Partnered with operations teams to map how they really work, then shipped React + MSAL apps and Kusto-backed APIs they use daily (parking kiosks, live gate map, concessions); incident response time down 40%.</w:t>
       </w:r>
     </w:p>
     <w:p>
@@ -428,12 +476,14 @@
       <w:r>
         <w:t xml:space="preserve">MCP server giving AI agents governed, audited, read-only access to lakehouse data; dbt layer with 16 data tests; CI eval gate on accuracy and 23 attack cases. </w:t>
       </w:r>
-      <w:r>
-        <w:rPr>
-          <w:color w:val="444444"/>
-        </w:rPr>
-        <w:t>github.com/SiddheshAmrale/agent-ready-lakehouse</w:t>
-      </w:r>
+      <w:hyperlink r:id="rId14">
+        <w:r>
+          <w:rPr>
+            <w:color w:val="1F4E8C"/>
+          </w:rPr>
+          <w:t xml:space="preserve">github.com/SiddheshAmrale/agent-ready-lakehouse</w:t>
+        </w:r>
+      </w:hyperlink>
     </w:p>
     <w:p>
       <w:pPr>
@@ -448,12 +498,14 @@
       <w:r>
         <w:t xml:space="preserve">Rust + libmpv media player: 5.6% CPU on HEVC vs 9.8% for stock mpv, 2.2 MB binary. </w:t>
       </w:r>
-      <w:r>
-        <w:rPr>
-          <w:color w:val="444444"/>
-        </w:rPr>
-        <w:t>github.com/SiddheshAmrale/vela</w:t>
-      </w:r>
+      <w:hyperlink r:id="rId15">
+        <w:r>
+          <w:rPr>
+            <w:color w:val="1F4E8C"/>
+          </w:rPr>
+          <w:t xml:space="preserve">github.com/SiddheshAmrale/vela</w:t>
+        </w:r>
+      </w:hyperlink>
     </w:p>
     <w:p>
       <w:pPr>
@@ -468,12 +520,14 @@
       <w:r>
         <w:t xml:space="preserve">Medallion lakehouse with CDC/SCD2, data contracts and freshness SLAs (Python, DuckDB). </w:t>
       </w:r>
-      <w:r>
-        <w:rPr>
-          <w:color w:val="444444"/>
-        </w:rPr>
-        <w:t>portfolio /labs/forge</w:t>
-      </w:r>
+      <w:hyperlink r:id="rId16">
+        <w:r>
+          <w:rPr>
+            <w:color w:val="1F4E8C"/>
+          </w:rPr>
+          <w:t xml:space="preserve">portfolio /labs/forge</w:t>
+        </w:r>
+      </w:hyperlink>
     </w:p>
     <w:p>
       <w:pPr>

</xml_diff>